<commit_message>
text updated new results
</commit_message>
<xml_diff>
--- a/supplements/GSV_validation_protocol.docx
+++ b/supplements/GSV_validation_protocol.docx
@@ -59,14 +59,7 @@
           <w:b/>
           <w:bCs/>
         </w:rPr>
-        <w:t>Cycling-infrastructure definition</w:t>
-      </w:r>
-      <w:r>
-        <w:rPr>
-          <w:b/>
-          <w:bCs/>
-        </w:rPr>
-        <w:t>.</w:t>
+        <w:t>Cycling-infrastructure definition.</w:t>
       </w:r>
       <w:r>
         <w:rPr/>
@@ -156,6 +149,20 @@
           <w:bCs/>
         </w:rPr>
         <w:t>Blue columns → main years (presence: 1/0/blank; month: 1–12)</w:t>
+      </w:r>
+    </w:p>
+    <w:p>
+      <w:pPr>
+        <w:pStyle w:val="BodyText"/>
+        <w:rPr/>
+      </w:pPr>
+      <w:r>
+        <w:rPr>
+          <w:rStyle w:val="Strong"/>
+          <w:b w:val="false"/>
+          <w:bCs w:val="false"/>
+        </w:rPr>
+        <w:t>For each year, coders record whether cycling infrastructure is present (1), absent (0), or not interpretable (blank), together with the month of the imagery shown in GSV. When more than one GSV image is available for the same year at a location, coders should use the image whose month is closest to the reference date.</w:t>
       </w:r>
     </w:p>
     <w:p>
@@ -242,7 +249,7 @@
         <w:rPr/>
         <w:t>: same rule.</w:t>
         <w:br/>
-        <w:t>If both years remain uninterpretable (including cases where the peg cannot be moved or year selection is unavailable) → leave them blank and use the fallback year.</w:t>
+        <w:t>If both years remain uninterpretable (including cases where the peg cannot be moved or year selection is unavailable), leave them blank and use the fallback year.</w:t>
       </w:r>
     </w:p>
     <w:p>
@@ -329,7 +336,7 @@
         <w:rPr/>
         <w:t>: same rule.</w:t>
         <w:br/>
-        <w:t>If both years remain uninterpretable (including cases where the peg cannot be moved or year selection is unavailable) → leave them blank and use the fallback year.</w:t>
+        <w:t>If both years remain uninterpretable (including cases where the peg cannot be moved or year selection is unavailable), leave them blank and use the fallback year.</w:t>
       </w:r>
     </w:p>
     <w:p>
@@ -354,15 +361,7 @@
       </w:pPr>
       <w:r>
         <w:rPr/>
-        <w:t>Used only when both main years for that period</w:t>
-      </w:r>
-      <w:r>
-        <w:rPr/>
-        <w:t xml:space="preserve"> (follow-up or baseline)</w:t>
-      </w:r>
-      <w:r>
-        <w:rPr/>
-        <w:t xml:space="preserve"> cannot be interpreted, even after a small peg adjustment (or when no adjustment is possible).</w:t>
+        <w:t>Used only when both main years for that period (follow-up or baseline) cannot be interpreted, even after a small peg adjustment (or when no adjustment is possible).</w:t>
       </w:r>
     </w:p>
     <w:p>
@@ -465,7 +464,7 @@
       </w:pPr>
       <w:r>
         <w:rPr/>
-        <w:t>Optional brief notes when something affects interpretation (peg movement, inability to move the peg, missing year options, blurred imagery, temporary works, ambiguous cases).</w:t>
+        <w:t>Brief notes should be recorded whenever something affects interpretation (for example peg movement, inability to move the peg, missing year options, blurred imagery, temporary works, apparent OSM realignments, or other ambiguous situations). Notes are not required when imagery is clear and straightforward.</w:t>
       </w:r>
     </w:p>
     <w:sectPr>

</xml_diff>